<commit_message>
Version 1.2.0 y el entregable con la columna nueva
CHANGELOG con los dos defectos y la pantalla nueva. API.md deja de decir que las preferencias son solo de pacientes.

El diccionario de datos del Entregable 2 incorpora cuidadores.preferencias, y el documento va regenerado.

Co-Authored-By: Claude Opus 5 <noreply@anthropic.com>

Claude-Session: https://claude.ai/code/session_018KC2BsPWUJMF1d6ss38tR5
</commit_message>
<xml_diff>
--- a/docs/Chronova-Entregable2-Diseno.docx
+++ b/docs/Chronova-Entregable2-Diseno.docx
@@ -5608,7 +5608,7 @@
                 <w:sz w:val="16"/>
                 <w:szCs w:val="16"/>
               </w:rPr>
-              <w:t xml:space="preserve">activo</w:t>
+              <w:t xml:space="preserve">preferencias</w:t>
             </w:r>
           </w:p>
         </w:tc>
@@ -5636,7 +5636,7 @@
                 <w:sz w:val="16"/>
                 <w:szCs w:val="16"/>
               </w:rPr>
-              <w:t xml:space="preserve">BOOLEAN</w:t>
+              <w:t xml:space="preserve">JSONB</w:t>
             </w:r>
           </w:p>
         </w:tc>
@@ -5664,7 +5664,7 @@
                 <w:sz w:val="16"/>
                 <w:szCs w:val="16"/>
               </w:rPr>
-              <w:t xml:space="preserve">Si la cuenta sigue vigente</w:t>
+              <w:t xml:space="preserve">Tamaño de letra, contraste y alertas</w:t>
             </w:r>
           </w:p>
         </w:tc>
@@ -5692,7 +5692,7 @@
                 <w:sz w:val="16"/>
                 <w:szCs w:val="16"/>
               </w:rPr>
-              <w:t xml:space="preserve">NOT NULL, DEFAULT TRUE</w:t>
+              <w:t xml:space="preserve">NOT NULL, DEFAULT '{}'</w:t>
             </w:r>
           </w:p>
         </w:tc>
@@ -5753,7 +5753,7 @@
                 <w:sz w:val="16"/>
                 <w:szCs w:val="16"/>
               </w:rPr>
-              <w:t xml:space="preserve">creado_en</w:t>
+              <w:t xml:space="preserve">activo</w:t>
             </w:r>
           </w:p>
         </w:tc>
@@ -5781,7 +5781,7 @@
                 <w:sz w:val="16"/>
                 <w:szCs w:val="16"/>
               </w:rPr>
-              <w:t xml:space="preserve">TIMESTAMPTZ</w:t>
+              <w:t xml:space="preserve">BOOLEAN</w:t>
             </w:r>
           </w:p>
         </w:tc>
@@ -5809,7 +5809,7 @@
                 <w:sz w:val="16"/>
                 <w:szCs w:val="16"/>
               </w:rPr>
-              <w:t xml:space="preserve">Fecha de creación</w:t>
+              <w:t xml:space="preserve">Si la cuenta sigue vigente</w:t>
             </w:r>
           </w:p>
         </w:tc>
@@ -5837,7 +5837,7 @@
                 <w:sz w:val="16"/>
                 <w:szCs w:val="16"/>
               </w:rPr>
-              <w:t xml:space="preserve">NOT NULL, DEFAULT NOW()</w:t>
+              <w:t xml:space="preserve">NOT NULL, DEFAULT TRUE</w:t>
             </w:r>
           </w:p>
         </w:tc>
@@ -5898,7 +5898,7 @@
                 <w:sz w:val="16"/>
                 <w:szCs w:val="16"/>
               </w:rPr>
-              <w:t xml:space="preserve">sesiones_validas_desde</w:t>
+              <w:t xml:space="preserve">creado_en</w:t>
             </w:r>
           </w:p>
         </w:tc>
@@ -5954,7 +5954,7 @@
                 <w:sz w:val="16"/>
                 <w:szCs w:val="16"/>
               </w:rPr>
-              <w:t xml:space="preserve">Desde cuándo se aceptan sus tokens</w:t>
+              <w:t xml:space="preserve">Fecha de creación</w:t>
             </w:r>
           </w:p>
         </w:tc>
@@ -6043,7 +6043,7 @@
                 <w:sz w:val="16"/>
                 <w:szCs w:val="16"/>
               </w:rPr>
-              <w:t xml:space="preserve">politica_version</w:t>
+              <w:t xml:space="preserve">sesiones_validas_desde</w:t>
             </w:r>
           </w:p>
         </w:tc>
@@ -6071,7 +6071,7 @@
                 <w:sz w:val="16"/>
                 <w:szCs w:val="16"/>
               </w:rPr>
-              <w:t xml:space="preserve">TEXT</w:t>
+              <w:t xml:space="preserve">TIMESTAMPTZ</w:t>
             </w:r>
           </w:p>
         </w:tc>
@@ -6099,7 +6099,7 @@
                 <w:sz w:val="16"/>
                 <w:szCs w:val="16"/>
               </w:rPr>
-              <w:t xml:space="preserve">Versión de la política de datos aceptada</w:t>
+              <w:t xml:space="preserve">Desde cuándo se aceptan sus tokens</w:t>
             </w:r>
           </w:p>
         </w:tc>
@@ -6127,7 +6127,7 @@
                 <w:sz w:val="16"/>
                 <w:szCs w:val="16"/>
               </w:rPr>
-              <w:t xml:space="preserve">Nulo si no consta</w:t>
+              <w:t xml:space="preserve">NOT NULL, DEFAULT NOW()</w:t>
             </w:r>
           </w:p>
         </w:tc>
@@ -6188,6 +6188,151 @@
                 <w:sz w:val="16"/>
                 <w:szCs w:val="16"/>
               </w:rPr>
+              <w:t xml:space="preserve">politica_version</w:t>
+            </w:r>
+          </w:p>
+        </w:tc>
+        <w:tc>
+          <w:tcPr>
+            <w:tcW w:type="dxa" w:w="1400"/>
+            <w:shd w:fill="FFFFFF" w:val="clear"/>
+            <w:tcMar>
+              <w:top w:type="dxa" w:w="60"/>
+              <w:left w:type="dxa" w:w="100"/>
+              <w:bottom w:type="dxa" w:w="60"/>
+              <w:right w:type="dxa" w:w="100"/>
+            </w:tcMar>
+          </w:tcPr>
+          <w:p>
+            <w:pPr>
+              <w:spacing w:after="0" w:line="240"/>
+              <w:jc w:val="left"/>
+            </w:pPr>
+            <w:r>
+              <w:rPr>
+                <w:rFonts w:ascii="Arial" w:cs="Arial" w:eastAsia="Arial" w:hAnsi="Arial"/>
+                <w:b w:val="false"/>
+                <w:bCs w:val="false"/>
+                <w:sz w:val="16"/>
+                <w:szCs w:val="16"/>
+              </w:rPr>
+              <w:t xml:space="preserve">TEXT</w:t>
+            </w:r>
+          </w:p>
+        </w:tc>
+        <w:tc>
+          <w:tcPr>
+            <w:tcW w:type="dxa" w:w="2100"/>
+            <w:shd w:fill="FFFFFF" w:val="clear"/>
+            <w:tcMar>
+              <w:top w:type="dxa" w:w="60"/>
+              <w:left w:type="dxa" w:w="100"/>
+              <w:bottom w:type="dxa" w:w="60"/>
+              <w:right w:type="dxa" w:w="100"/>
+            </w:tcMar>
+          </w:tcPr>
+          <w:p>
+            <w:pPr>
+              <w:spacing w:after="0" w:line="240"/>
+              <w:jc w:val="left"/>
+            </w:pPr>
+            <w:r>
+              <w:rPr>
+                <w:rFonts w:ascii="Arial" w:cs="Arial" w:eastAsia="Arial" w:hAnsi="Arial"/>
+                <w:b w:val="false"/>
+                <w:bCs w:val="false"/>
+                <w:sz w:val="16"/>
+                <w:szCs w:val="16"/>
+              </w:rPr>
+              <w:t xml:space="preserve">Versión de la política de datos aceptada</w:t>
+            </w:r>
+          </w:p>
+        </w:tc>
+        <w:tc>
+          <w:tcPr>
+            <w:tcW w:type="dxa" w:w="1760"/>
+            <w:shd w:fill="FFFFFF" w:val="clear"/>
+            <w:tcMar>
+              <w:top w:type="dxa" w:w="60"/>
+              <w:left w:type="dxa" w:w="100"/>
+              <w:bottom w:type="dxa" w:w="60"/>
+              <w:right w:type="dxa" w:w="100"/>
+            </w:tcMar>
+          </w:tcPr>
+          <w:p>
+            <w:pPr>
+              <w:spacing w:after="0" w:line="240"/>
+              <w:jc w:val="left"/>
+            </w:pPr>
+            <w:r>
+              <w:rPr>
+                <w:rFonts w:ascii="Arial" w:cs="Arial" w:eastAsia="Arial" w:hAnsi="Arial"/>
+                <w:b w:val="false"/>
+                <w:bCs w:val="false"/>
+                <w:sz w:val="16"/>
+                <w:szCs w:val="16"/>
+              </w:rPr>
+              <w:t xml:space="preserve">Nulo si no consta</w:t>
+            </w:r>
+          </w:p>
+        </w:tc>
+        <w:tc>
+          <w:tcPr>
+            <w:tcW w:type="dxa" w:w="1400"/>
+            <w:shd w:fill="FFFFFF" w:val="clear"/>
+            <w:tcMar>
+              <w:top w:type="dxa" w:w="60"/>
+              <w:left w:type="dxa" w:w="100"/>
+              <w:bottom w:type="dxa" w:w="60"/>
+              <w:right w:type="dxa" w:w="100"/>
+            </w:tcMar>
+          </w:tcPr>
+          <w:p>
+            <w:pPr>
+              <w:spacing w:after="0" w:line="240"/>
+              <w:jc w:val="left"/>
+            </w:pPr>
+            <w:r>
+              <w:rPr>
+                <w:rFonts w:ascii="Arial" w:cs="Arial" w:eastAsia="Arial" w:hAnsi="Arial"/>
+                <w:b w:val="false"/>
+                <w:bCs w:val="false"/>
+                <w:sz w:val="16"/>
+                <w:szCs w:val="16"/>
+              </w:rPr>
+              <w:t xml:space="preserve">—</w:t>
+            </w:r>
+          </w:p>
+        </w:tc>
+      </w:tr>
+      <w:tr>
+        <w:trPr>
+          <w:cantSplit/>
+        </w:trPr>
+        <w:tc>
+          <w:tcPr>
+            <w:tcW w:type="dxa" w:w="2100"/>
+            <w:shd w:fill="F7F9FA" w:val="clear"/>
+            <w:tcMar>
+              <w:top w:type="dxa" w:w="60"/>
+              <w:left w:type="dxa" w:w="100"/>
+              <w:bottom w:type="dxa" w:w="60"/>
+              <w:right w:type="dxa" w:w="100"/>
+            </w:tcMar>
+          </w:tcPr>
+          <w:p>
+            <w:pPr>
+              <w:spacing w:after="0" w:line="240"/>
+              <w:jc w:val="left"/>
+            </w:pPr>
+            <w:r>
+              <w:rPr>
+                <w:rFonts w:ascii="Arial" w:cs="Arial" w:eastAsia="Arial" w:hAnsi="Arial"/>
+                <w:b w:val="false"/>
+                <w:bCs w:val="false"/>
+                <w:sz w:val="16"/>
+                <w:szCs w:val="16"/>
+              </w:rPr>
               <w:t xml:space="preserve">politica_aceptada_en</w:t>
             </w:r>
           </w:p>
@@ -6195,7 +6340,7 @@
         <w:tc>
           <w:tcPr>
             <w:tcW w:type="dxa" w:w="1400"/>
-            <w:shd w:fill="FFFFFF" w:val="clear"/>
+            <w:shd w:fill="F7F9FA" w:val="clear"/>
             <w:tcMar>
               <w:top w:type="dxa" w:w="60"/>
               <w:left w:type="dxa" w:w="100"/>
@@ -6223,7 +6368,7 @@
         <w:tc>
           <w:tcPr>
             <w:tcW w:type="dxa" w:w="2100"/>
-            <w:shd w:fill="FFFFFF" w:val="clear"/>
+            <w:shd w:fill="F7F9FA" w:val="clear"/>
             <w:tcMar>
               <w:top w:type="dxa" w:w="60"/>
               <w:left w:type="dxa" w:w="100"/>
@@ -6251,7 +6396,7 @@
         <w:tc>
           <w:tcPr>
             <w:tcW w:type="dxa" w:w="1760"/>
-            <w:shd w:fill="FFFFFF" w:val="clear"/>
+            <w:shd w:fill="F7F9FA" w:val="clear"/>
             <w:tcMar>
               <w:top w:type="dxa" w:w="60"/>
               <w:left w:type="dxa" w:w="100"/>
@@ -6279,7 +6424,7 @@
         <w:tc>
           <w:tcPr>
             <w:tcW w:type="dxa" w:w="1400"/>
-            <w:shd w:fill="FFFFFF" w:val="clear"/>
+            <w:shd w:fill="F7F9FA" w:val="clear"/>
             <w:tcMar>
               <w:top w:type="dxa" w:w="60"/>
               <w:left w:type="dxa" w:w="100"/>

</xml_diff>

<commit_message>
Diagramas redibujados con la identidad visual de la app
</commit_message>
<xml_diff>
--- a/docs/Chronova-Entregable2-Diseno.docx
+++ b/docs/Chronova-Entregable2-Diseno.docx
@@ -911,7 +911,7 @@
       <w:r>
         <w:drawing>
           <wp:inline distT="0" distB="0" distL="0" distR="0">
-            <wp:extent cx="8572500" cy="3886200"/>
+            <wp:extent cx="6934200" cy="5334000"/>
             <wp:effectExtent t="0" r="0" b="0" l="0"/>
             <wp:docPr id="1" name="" descr="" title=""/>
             <wp:cNvGraphicFramePr>
@@ -936,7 +936,7 @@
                   <pic:spPr bwMode="auto">
                     <a:xfrm>
                       <a:off x="0" y="0"/>
-                      <a:ext cx="8572500" cy="3886200"/>
+                      <a:ext cx="6934200" cy="5334000"/>
                     </a:xfrm>
                     <a:prstGeom prst="rect">
                       <a:avLst/>
@@ -967,6 +967,16 @@
     </w:p>
     <w:p>
       <w:pPr>
+        <w:sectPr>
+          <w:pgSz w:w="15840" w:h="12240" w:orient="landscape"/>
+          <w:pgMar w:top="1080" w:right="1080" w:bottom="1080" w:left="1080" w:header="708" w:footer="708" w:gutter="0"/>
+          <w:pgNumType/>
+          <w:docGrid w:linePitch="360"/>
+        </w:sectPr>
+      </w:pPr>
+    </w:p>
+    <w:p>
+      <w:pPr>
         <w:spacing w:after="200" w:line="276"/>
         <w:ind w:left="1750" w:right="1750"/>
         <w:jc w:val="both"/>
@@ -979,16 +989,6 @@
         </w:rPr>
         <w:t xml:space="preserve">El diagrama permite comprobar dos propiedades. La primera es que hay dos adaptadores distintos cumpliendo el mismo puerto de repositorios, PostgreSQL y en memoria, y que la aplicación funciona con cualquiera de los dos sin que el dominio cambie. La segunda es que ningún componente del dominio tiene una flecha que salga hacia una capa externa.</w:t>
       </w:r>
-    </w:p>
-    <w:p>
-      <w:pPr>
-        <w:sectPr>
-          <w:pgSz w:w="15840" w:h="12240" w:orient="landscape"/>
-          <w:pgMar w:top="1080" w:right="1080" w:bottom="1080" w:left="1080" w:header="708" w:footer="708" w:gutter="0"/>
-          <w:pgNumType/>
-          <w:docGrid w:linePitch="360"/>
-        </w:sectPr>
-      </w:pPr>
     </w:p>
     <w:p>
       <w:pPr>
@@ -2337,7 +2337,7 @@
       <w:r>
         <w:drawing>
           <wp:inline distT="0" distB="0" distL="0" distR="0">
-            <wp:extent cx="8572500" cy="4295775"/>
+            <wp:extent cx="8267700" cy="5334000"/>
             <wp:effectExtent t="0" r="0" b="0" l="0"/>
             <wp:docPr id="1" name="" descr="" title=""/>
             <wp:cNvGraphicFramePr>
@@ -2362,7 +2362,7 @@
                   <pic:spPr bwMode="auto">
                     <a:xfrm>
                       <a:off x="0" y="0"/>
-                      <a:ext cx="8572500" cy="4295775"/>
+                      <a:ext cx="8267700" cy="5334000"/>
                     </a:xfrm>
                     <a:prstGeom prst="rect">
                       <a:avLst/>
@@ -2393,6 +2393,16 @@
     </w:p>
     <w:p>
       <w:pPr>
+        <w:sectPr>
+          <w:pgSz w:w="15840" w:h="12240" w:orient="landscape"/>
+          <w:pgMar w:top="1080" w:right="1080" w:bottom="1080" w:left="1080" w:header="708" w:footer="708" w:gutter="0"/>
+          <w:pgNumType/>
+          <w:docGrid w:linePitch="360"/>
+        </w:sectPr>
+      </w:pPr>
+    </w:p>
+    <w:p>
+      <w:pPr>
         <w:spacing w:after="200" w:line="276"/>
         <w:ind w:left="1750" w:right="1750"/>
         <w:jc w:val="both"/>
@@ -2415,16 +2425,6 @@
         </w:rPr>
         <w:t xml:space="preserve">Ambas tablas tienen una columna que apunta a pacientes o a cuidadores según el valor de otra columna, y PostgreSQL no admite una clave foránea con dos destinos posibles. Es un compromiso consciente: se pierde la integridad referencial de esas dos columnas, que pasa a cuidar la aplicación, y a cambio no hacen falta cuatro tablas casi idénticas.</w:t>
       </w:r>
-    </w:p>
-    <w:p>
-      <w:pPr>
-        <w:sectPr>
-          <w:pgSz w:w="15840" w:h="12240" w:orient="landscape"/>
-          <w:pgMar w:top="1080" w:right="1080" w:bottom="1080" w:left="1080" w:header="708" w:footer="708" w:gutter="0"/>
-          <w:pgNumType/>
-          <w:docGrid w:linePitch="360"/>
-        </w:sectPr>
-      </w:pPr>
     </w:p>
     <w:p>
       <w:pPr>
@@ -21713,16 +21713,6 @@
     </w:p>
     <w:p>
       <w:pPr>
-        <w:sectPr>
-          <w:pgSz w:w="12240" w:h="15840" w:orient="portrait"/>
-          <w:pgMar w:top="1440" w:right="1440" w:bottom="1440" w:left="2041" w:header="708" w:footer="708" w:gutter="0"/>
-          <w:pgNumType/>
-          <w:docGrid w:linePitch="360"/>
-        </w:sectPr>
-      </w:pPr>
-    </w:p>
-    <w:p>
-      <w:pPr>
         <w:pStyle w:val="Heading2"/>
         <w:spacing w:after="200" w:before="400"/>
       </w:pPr>
@@ -21761,7 +21751,7 @@
       <w:r>
         <w:drawing>
           <wp:inline distT="0" distB="0" distL="0" distR="0">
-            <wp:extent cx="6934200" cy="5334000"/>
+            <wp:extent cx="5524500" cy="5981700"/>
             <wp:effectExtent t="0" r="0" b="0" l="0"/>
             <wp:docPr id="1" name="" descr="" title=""/>
             <wp:cNvGraphicFramePr>
@@ -21786,7 +21776,7 @@
                   <pic:spPr bwMode="auto">
                     <a:xfrm>
                       <a:off x="0" y="0"/>
-                      <a:ext cx="6934200" cy="5334000"/>
+                      <a:ext cx="5524500" cy="5981700"/>
                     </a:xfrm>
                     <a:prstGeom prst="rect">
                       <a:avLst/>
@@ -21832,23 +21822,13 @@
     </w:p>
     <w:p>
       <w:pPr>
-        <w:sectPr>
-          <w:pgSz w:w="15840" w:h="12240" w:orient="landscape"/>
-          <w:pgMar w:top="1080" w:right="1080" w:bottom="1080" w:left="1080" w:header="708" w:footer="708" w:gutter="0"/>
-          <w:pgNumType/>
-          <w:docGrid w:linePitch="360"/>
-        </w:sectPr>
-      </w:pPr>
-    </w:p>
-    <w:p>
-      <w:pPr>
         <w:spacing w:after="80" w:before="120"/>
         <w:jc w:val="center"/>
       </w:pPr>
       <w:r>
         <w:drawing>
           <wp:inline distT="0" distB="0" distL="0" distR="0">
-            <wp:extent cx="8134350" cy="5334000"/>
+            <wp:extent cx="5524500" cy="5619750"/>
             <wp:effectExtent t="0" r="0" b="0" l="0"/>
             <wp:docPr id="1" name="" descr="" title=""/>
             <wp:cNvGraphicFramePr>
@@ -21873,7 +21853,7 @@
                   <pic:spPr bwMode="auto">
                     <a:xfrm>
                       <a:off x="0" y="0"/>
-                      <a:ext cx="8134350" cy="5334000"/>
+                      <a:ext cx="5524500" cy="5619750"/>
                     </a:xfrm>
                     <a:prstGeom prst="rect">
                       <a:avLst/>
@@ -21916,16 +21896,6 @@
         </w:rPr>
         <w:t xml:space="preserve">El segundo muestra cómo un patrón como «una pastilla a las 8:00 todos los días» se convierte en tomas concretas que el paciente puede confirmar, y cómo se resuelve el caso en que dos peticiones piden la agenda del mismo día simultáneamente.</w:t>
       </w:r>
-    </w:p>
-    <w:p>
-      <w:pPr>
-        <w:sectPr>
-          <w:pgSz w:w="15840" w:h="12240" w:orient="landscape"/>
-          <w:pgMar w:top="1080" w:right="1080" w:bottom="1080" w:left="1080" w:header="708" w:footer="708" w:gutter="0"/>
-          <w:pgNumType/>
-          <w:docGrid w:linePitch="360"/>
-        </w:sectPr>
-      </w:pPr>
     </w:p>
     <w:p>
       <w:pPr>
@@ -26467,13 +26437,23 @@
     </w:p>
     <w:p>
       <w:pPr>
+        <w:sectPr>
+          <w:pgSz w:w="12240" w:h="15840" w:orient="portrait"/>
+          <w:pgMar w:top="1440" w:right="1440" w:bottom="1440" w:left="2041" w:header="708" w:footer="708" w:gutter="0"/>
+          <w:pgNumType/>
+          <w:docGrid w:linePitch="360"/>
+        </w:sectPr>
+      </w:pPr>
+    </w:p>
+    <w:p>
+      <w:pPr>
         <w:spacing w:after="80" w:before="120"/>
         <w:jc w:val="center"/>
       </w:pPr>
       <w:r>
         <w:drawing>
           <wp:inline distT="0" distB="0" distL="0" distR="0">
-            <wp:extent cx="4419600" cy="7620000"/>
+            <wp:extent cx="6391275" cy="5334000"/>
             <wp:effectExtent t="0" r="0" b="0" l="0"/>
             <wp:docPr id="1" name="" descr="" title=""/>
             <wp:cNvGraphicFramePr>
@@ -26498,7 +26478,7 @@
                   <pic:spPr bwMode="auto">
                     <a:xfrm>
                       <a:off x="0" y="0"/>
-                      <a:ext cx="4419600" cy="7620000"/>
+                      <a:ext cx="6391275" cy="5334000"/>
                     </a:xfrm>
                     <a:prstGeom prst="rect">
                       <a:avLst/>
@@ -26530,8 +26510,8 @@
     <w:p>
       <w:pPr>
         <w:sectPr>
-          <w:pgSz w:w="12240" w:h="15840" w:orient="portrait"/>
-          <w:pgMar w:top="1440" w:right="1440" w:bottom="1440" w:left="2041" w:header="708" w:footer="708" w:gutter="0"/>
+          <w:pgSz w:w="15840" w:h="12240" w:orient="landscape"/>
+          <w:pgMar w:top="1080" w:right="1080" w:bottom="1080" w:left="1080" w:header="708" w:footer="708" w:gutter="0"/>
           <w:pgNumType/>
           <w:docGrid w:linePitch="360"/>
         </w:sectPr>
@@ -26562,7 +26542,7 @@
       <w:r>
         <w:drawing>
           <wp:inline distT="0" distB="0" distL="0" distR="0">
-            <wp:extent cx="8572500" cy="3914775"/>
+            <wp:extent cx="5524500" cy="5257800"/>
             <wp:effectExtent t="0" r="0" b="0" l="0"/>
             <wp:docPr id="1" name="" descr="" title=""/>
             <wp:cNvGraphicFramePr>
@@ -26587,7 +26567,7 @@
                   <pic:spPr bwMode="auto">
                     <a:xfrm>
                       <a:off x="0" y="0"/>
-                      <a:ext cx="8572500" cy="3914775"/>
+                      <a:ext cx="5524500" cy="5257800"/>
                     </a:xfrm>
                     <a:prstGeom prst="rect">
                       <a:avLst/>
@@ -26630,16 +26610,6 @@
         </w:rPr>
         <w:t xml:space="preserve">El estado compartido vive en contextos y no en las pantallas. SesionContexto guarda quién inició sesión y sus preferencias, y envuelve toda la aplicación. PacienteObservadoContexto existe por una razón concreta: las tres pestañas de la ficha del paciente necesitan los mismos datos, de modo que se cargan una sola vez y las pestañas únicamente presentan. Sin él serían tres veces las mismas peticiones y tres lugares donde repetir la comprobación de permisos.</w:t>
       </w:r>
-    </w:p>
-    <w:p>
-      <w:pPr>
-        <w:sectPr>
-          <w:pgSz w:w="15840" w:h="12240" w:orient="landscape"/>
-          <w:pgMar w:top="1080" w:right="1080" w:bottom="1080" w:left="1080" w:header="708" w:footer="708" w:gutter="0"/>
-          <w:pgNumType/>
-          <w:docGrid w:linePitch="360"/>
-        </w:sectPr>
-      </w:pPr>
     </w:p>
     <w:p>
       <w:pPr>

</xml_diff>